<commit_message>
atualiza link e ícone do documento de controle de estoque para PDF
</commit_message>
<xml_diff>
--- a/images/POP — Controle de Estoque de TI no Sistema TIStock.docx
+++ b/images/POP — Controle de Estoque de TI no Sistema TIStock.docx
@@ -162,7 +162,7 @@
           <w:noProof/>
         </w:rPr>
         <w:pict w14:anchorId="497F97A2">
-          <v:rect id="_x0000_s1042" alt="" style="width:475.5pt;height:.05pt;mso-width-percent:0;mso-height-percent:0;mso-left-percent:-10001;mso-top-percent:-10001;mso-position-horizontal:absolute;mso-position-horizontal-relative:char;mso-position-vertical:absolute;mso-position-vertical-relative:line;mso-width-percent:0;mso-height-percent:0;mso-left-percent:-10001;mso-top-percent:-10001" o:hralign="center" o:hrstd="t" strokeweight="1pt">
+          <v:rect id="_x0000_s1040" alt="" style="width:475.5pt;height:.05pt;mso-width-percent:0;mso-height-percent:0;mso-left-percent:-10001;mso-top-percent:-10001;mso-position-horizontal:absolute;mso-position-horizontal-relative:char;mso-position-vertical:absolute;mso-position-vertical-relative:line;mso-width-percent:0;mso-height-percent:0;mso-left-percent:-10001;mso-top-percent:-10001" o:hralign="center" o:hrstd="t" strokeweight="1pt">
             <v:stroke opacity="0"/>
           </v:rect>
         </w:pict>
@@ -293,7 +293,7 @@
           <w:noProof/>
         </w:rPr>
         <w:pict w14:anchorId="0A490FC5">
-          <v:rect id="_x0000_s1041" alt="" style="width:475.5pt;height:.05pt;mso-width-percent:0;mso-height-percent:0;mso-left-percent:-10001;mso-top-percent:-10001;mso-position-horizontal:absolute;mso-position-horizontal-relative:char;mso-position-vertical:absolute;mso-position-vertical-relative:line;mso-width-percent:0;mso-height-percent:0;mso-left-percent:-10001;mso-top-percent:-10001" o:hralign="center" o:hrstd="t" strokeweight="1pt">
+          <v:rect id="_x0000_s1039" alt="" style="width:475.5pt;height:.05pt;mso-width-percent:0;mso-height-percent:0;mso-left-percent:-10001;mso-top-percent:-10001;mso-position-horizontal:absolute;mso-position-horizontal-relative:char;mso-position-vertical:absolute;mso-position-vertical-relative:line;mso-width-percent:0;mso-height-percent:0;mso-left-percent:-10001;mso-top-percent:-10001" o:hralign="center" o:hrstd="t" strokeweight="1pt">
             <v:stroke opacity="0"/>
           </v:rect>
         </w:pict>
@@ -364,7 +364,7 @@
           <w:noProof/>
         </w:rPr>
         <w:pict w14:anchorId="73FA2044">
-          <v:rect id="_x0000_s1040" alt="" style="width:475.5pt;height:.05pt;mso-width-percent:0;mso-height-percent:0;mso-left-percent:-10001;mso-top-percent:-10001;mso-position-horizontal:absolute;mso-position-horizontal-relative:char;mso-position-vertical:absolute;mso-position-vertical-relative:line;mso-width-percent:0;mso-height-percent:0;mso-left-percent:-10001;mso-top-percent:-10001" o:hralign="center" o:hrstd="t" strokeweight="1pt">
+          <v:rect id="_x0000_s1038" alt="" style="width:475.5pt;height:.05pt;mso-width-percent:0;mso-height-percent:0;mso-left-percent:-10001;mso-top-percent:-10001;mso-position-horizontal:absolute;mso-position-horizontal-relative:char;mso-position-vertical:absolute;mso-position-vertical-relative:line;mso-width-percent:0;mso-height-percent:0;mso-left-percent:-10001;mso-top-percent:-10001" o:hralign="center" o:hrstd="t" strokeweight="1pt">
             <v:stroke opacity="0"/>
           </v:rect>
         </w:pict>
@@ -629,7 +629,14 @@
           <w:color w:val="000000"/>
         </w:rPr>
         <w:lastRenderedPageBreak/>
-        <w:t>📌 Todos os perfis podem alterar sua própria senha pelo menu do usuário no canto superior direito.</w:t>
+        <w:t>📌</w:t>
+      </w:r>
+      <w:r>
+        <w:rPr>
+          <w:rFonts w:eastAsia="Georgia" w:hAnsi="Georgia" w:cs="Georgia"/>
+          <w:color w:val="000000"/>
+        </w:rPr>
+        <w:t xml:space="preserve"> Todos os perfis podem alterar sua própria senha pelo menu do usuário no canto superior direito.</w:t>
       </w:r>
     </w:p>
     <w:p>
@@ -646,7 +653,7 @@
           <w:noProof/>
         </w:rPr>
         <w:pict w14:anchorId="7C072E4D">
-          <v:rect id="_x0000_s1039" alt="" style="width:475.5pt;height:.05pt;mso-width-percent:0;mso-height-percent:0;mso-left-percent:-10001;mso-top-percent:-10001;mso-position-horizontal:absolute;mso-position-horizontal-relative:char;mso-position-vertical:absolute;mso-position-vertical-relative:line;mso-width-percent:0;mso-height-percent:0;mso-left-percent:-10001;mso-top-percent:-10001" o:hralign="center" o:hrstd="t" strokeweight="1pt">
+          <v:rect id="_x0000_s1037" alt="" style="width:475.5pt;height:.05pt;mso-width-percent:0;mso-height-percent:0;mso-left-percent:-10001;mso-top-percent:-10001;mso-position-horizontal:absolute;mso-position-horizontal-relative:char;mso-position-vertical:absolute;mso-position-vertical-relative:line;mso-width-percent:0;mso-height-percent:0;mso-left-percent:-10001;mso-top-percent:-10001" o:hralign="center" o:hrstd="t" strokeweight="1pt">
             <v:stroke opacity="0"/>
           </v:rect>
         </w:pict>
@@ -775,7 +782,21 @@
           <w:rFonts w:eastAsia="Georgia" w:hAnsi="Georgia" w:cs="Georgia"/>
           <w:color w:val="000000"/>
         </w:rPr>
-        <w:t>⚠️ Em caso de esquecimento de senha, solicite a redefinição ao Administrador do sistema.</w:t>
+        <w:t>⚠</w:t>
+      </w:r>
+      <w:r>
+        <w:rPr>
+          <w:rFonts w:eastAsia="Georgia" w:hAnsi="Georgia" w:cs="Georgia"/>
+          <w:color w:val="000000"/>
+        </w:rPr>
+        <w:t>️</w:t>
+      </w:r>
+      <w:r>
+        <w:rPr>
+          <w:rFonts w:eastAsia="Georgia" w:hAnsi="Georgia" w:cs="Georgia"/>
+          <w:color w:val="000000"/>
+        </w:rPr>
+        <w:t xml:space="preserve"> Em caso de esquecimento de senha, solicite a redefinição ao Administrador do sistema.</w:t>
       </w:r>
     </w:p>
     <w:p>
@@ -924,7 +945,7 @@
           <w:szCs w:val="16"/>
         </w:rPr>
         <w:pict w14:anchorId="1854ED33">
-          <v:rect id="_x0000_s1038" alt="" style="width:475.5pt;height:.05pt;mso-width-percent:0;mso-height-percent:0;mso-left-percent:-10001;mso-top-percent:-10001;mso-position-horizontal:absolute;mso-position-horizontal-relative:char;mso-position-vertical:absolute;mso-position-vertical-relative:line;mso-width-percent:0;mso-height-percent:0;mso-left-percent:-10001;mso-top-percent:-10001" o:hralign="center" o:hrstd="t" strokeweight="1pt">
+          <v:rect id="_x0000_s1036" alt="" style="width:475.5pt;height:.05pt;mso-width-percent:0;mso-height-percent:0;mso-left-percent:-10001;mso-top-percent:-10001;mso-position-horizontal:absolute;mso-position-horizontal-relative:char;mso-position-vertical:absolute;mso-position-vertical-relative:line;mso-width-percent:0;mso-height-percent:0;mso-left-percent:-10001;mso-top-percent:-10001" o:hralign="center" o:hrstd="t" strokeweight="1pt">
             <v:stroke opacity="0"/>
           </v:rect>
         </w:pict>
@@ -1458,7 +1479,14 @@
           <w:rFonts w:eastAsia="Georgia" w:hAnsi="Georgia" w:cs="Georgia"/>
           <w:color w:val="000000"/>
         </w:rPr>
-        <w:t>📌 O estoque do item será atualizado automaticamente após a confirmação.</w:t>
+        <w:t>📌</w:t>
+      </w:r>
+      <w:r>
+        <w:rPr>
+          <w:rFonts w:eastAsia="Georgia" w:hAnsi="Georgia" w:cs="Georgia"/>
+          <w:color w:val="000000"/>
+        </w:rPr>
+        <w:t xml:space="preserve"> O estoque do item será atualizado automaticamente após a confirmação.</w:t>
       </w:r>
     </w:p>
     <w:p>
@@ -1483,7 +1511,7 @@
           <w:szCs w:val="16"/>
         </w:rPr>
         <w:pict w14:anchorId="1678ACED">
-          <v:rect id="_x0000_s1037" alt="" style="width:475.5pt;height:.05pt;mso-width-percent:0;mso-height-percent:0;mso-left-percent:-10001;mso-top-percent:-10001;mso-position-horizontal:absolute;mso-position-horizontal-relative:char;mso-position-vertical:absolute;mso-position-vertical-relative:line;mso-width-percent:0;mso-height-percent:0;mso-left-percent:-10001;mso-top-percent:-10001" o:hralign="center" o:hrstd="t" strokeweight="1pt">
+          <v:rect id="_x0000_s1035" alt="" style="width:475.5pt;height:.05pt;mso-width-percent:0;mso-height-percent:0;mso-left-percent:-10001;mso-top-percent:-10001;mso-position-horizontal:absolute;mso-position-horizontal-relative:char;mso-position-vertical:absolute;mso-position-vertical-relative:line;mso-width-percent:0;mso-height-percent:0;mso-left-percent:-10001;mso-top-percent:-10001" o:hralign="center" o:hrstd="t" strokeweight="1pt">
             <v:stroke opacity="0"/>
           </v:rect>
         </w:pict>
@@ -1536,7 +1564,21 @@
           <w:rFonts w:eastAsia="Georgia" w:hAnsi="Georgia" w:cs="Georgia"/>
           <w:color w:val="000000"/>
         </w:rPr>
-        <w:t xml:space="preserve">⚠️ Para empréstimos com previsão de devolução, utilize o módulo </w:t>
+        <w:t>⚠</w:t>
+      </w:r>
+      <w:r>
+        <w:rPr>
+          <w:rFonts w:eastAsia="Georgia" w:hAnsi="Georgia" w:cs="Georgia"/>
+          <w:color w:val="000000"/>
+        </w:rPr>
+        <w:t>️</w:t>
+      </w:r>
+      <w:r>
+        <w:rPr>
+          <w:rFonts w:eastAsia="Georgia" w:hAnsi="Georgia" w:cs="Georgia"/>
+          <w:color w:val="000000"/>
+        </w:rPr>
+        <w:t xml:space="preserve"> Para empréstimos com previsão de devolução, utilize o módulo </w:t>
       </w:r>
       <w:r>
         <w:rPr>
@@ -2054,7 +2096,21 @@
           <w:rFonts w:eastAsia="Georgia" w:hAnsi="Georgia" w:cs="Georgia"/>
           <w:color w:val="000000"/>
         </w:rPr>
-        <w:t>⚠️ Não é possível registrar saída com quantidade superior ao estoque disponível.</w:t>
+        <w:t>⚠</w:t>
+      </w:r>
+      <w:r>
+        <w:rPr>
+          <w:rFonts w:eastAsia="Georgia" w:hAnsi="Georgia" w:cs="Georgia"/>
+          <w:color w:val="000000"/>
+        </w:rPr>
+        <w:t>️</w:t>
+      </w:r>
+      <w:r>
+        <w:rPr>
+          <w:rFonts w:eastAsia="Georgia" w:hAnsi="Georgia" w:cs="Georgia"/>
+          <w:color w:val="000000"/>
+        </w:rPr>
+        <w:t xml:space="preserve"> Não é possível registrar saída com quantidade superior ao estoque disponível.</w:t>
       </w:r>
     </w:p>
     <w:p>
@@ -2079,7 +2135,7 @@
           <w:szCs w:val="16"/>
         </w:rPr>
         <w:pict w14:anchorId="36A81C40">
-          <v:rect id="_x0000_s1036" alt="" style="width:475.5pt;height:.05pt;mso-width-percent:0;mso-height-percent:0;mso-left-percent:-10001;mso-top-percent:-10001;mso-position-horizontal:absolute;mso-position-horizontal-relative:char;mso-position-vertical:absolute;mso-position-vertical-relative:line;mso-width-percent:0;mso-height-percent:0;mso-left-percent:-10001;mso-top-percent:-10001" o:hralign="center" o:hrstd="t" strokeweight="1pt">
+          <v:rect id="_x0000_s1034" alt="" style="width:475.5pt;height:.05pt;mso-width-percent:0;mso-height-percent:0;mso-left-percent:-10001;mso-top-percent:-10001;mso-position-horizontal:absolute;mso-position-horizontal-relative:char;mso-position-vertical:absolute;mso-position-vertical-relative:line;mso-width-percent:0;mso-height-percent:0;mso-left-percent:-10001;mso-top-percent:-10001" o:hralign="center" o:hrstd="t" strokeweight="1pt">
             <v:stroke opacity="0"/>
           </v:rect>
         </w:pict>
@@ -2629,7 +2685,21 @@
           <w:rFonts w:eastAsia="Georgia" w:hAnsi="Georgia" w:cs="Georgia"/>
           <w:color w:val="000000"/>
         </w:rPr>
-        <w:t xml:space="preserve"> clicando no ícone 🖨 na listagem de empréstimos</w:t>
+        <w:t xml:space="preserve"> clicando no ícone </w:t>
+      </w:r>
+      <w:r>
+        <w:rPr>
+          <w:rFonts w:eastAsia="Georgia" w:hAnsi="Georgia" w:cs="Georgia"/>
+          <w:color w:val="000000"/>
+        </w:rPr>
+        <w:t>🖨</w:t>
+      </w:r>
+      <w:r>
+        <w:rPr>
+          <w:rFonts w:eastAsia="Georgia" w:hAnsi="Georgia" w:cs="Georgia"/>
+          <w:color w:val="000000"/>
+        </w:rPr>
+        <w:t xml:space="preserve"> na listagem de empréstimos</w:t>
       </w:r>
     </w:p>
     <w:p>
@@ -2674,7 +2744,14 @@
           <w:color w:val="000000"/>
         </w:rPr>
         <w:lastRenderedPageBreak/>
-        <w:t>📌 Guarde o recibo impresso no arquivo físico do setor.</w:t>
+        <w:t>📌</w:t>
+      </w:r>
+      <w:r>
+        <w:rPr>
+          <w:rFonts w:eastAsia="Georgia" w:hAnsi="Georgia" w:cs="Georgia"/>
+          <w:color w:val="000000"/>
+        </w:rPr>
+        <w:t xml:space="preserve"> Guarde o recibo impresso no arquivo físico do setor.</w:t>
       </w:r>
     </w:p>
     <w:p>
@@ -2785,7 +2862,15 @@
           <w:b/>
           <w:color w:val="000000"/>
         </w:rPr>
-        <w:t>↩ Devolver</w:t>
+        <w:t>↩</w:t>
+      </w:r>
+      <w:r>
+        <w:rPr>
+          <w:rFonts w:eastAsia="Georgia" w:hAnsi="Georgia" w:cs="Georgia"/>
+          <w:b/>
+          <w:color w:val="000000"/>
+        </w:rPr>
+        <w:t xml:space="preserve"> Devolver</w:t>
       </w:r>
       <w:r>
         <w:rPr>
@@ -2837,7 +2922,21 @@
           <w:rFonts w:eastAsia="Georgia" w:hAnsi="Georgia" w:cs="Georgia"/>
           <w:color w:val="000000"/>
         </w:rPr>
-        <w:t xml:space="preserve">⚠️ Empréstimos com data vencida são sinalizados em </w:t>
+        <w:t>⚠</w:t>
+      </w:r>
+      <w:r>
+        <w:rPr>
+          <w:rFonts w:eastAsia="Georgia" w:hAnsi="Georgia" w:cs="Georgia"/>
+          <w:color w:val="000000"/>
+        </w:rPr>
+        <w:t>️</w:t>
+      </w:r>
+      <w:r>
+        <w:rPr>
+          <w:rFonts w:eastAsia="Georgia" w:hAnsi="Georgia" w:cs="Georgia"/>
+          <w:color w:val="000000"/>
+        </w:rPr>
+        <w:t xml:space="preserve"> Empréstimos com data vencida são sinalizados em </w:t>
       </w:r>
       <w:r>
         <w:rPr>
@@ -2869,7 +2968,7 @@
           <w:noProof/>
         </w:rPr>
         <w:pict w14:anchorId="32FD5DA3">
-          <v:rect id="_x0000_s1035" alt="" style="width:475.5pt;height:.05pt;mso-width-percent:0;mso-height-percent:0;mso-left-percent:-10001;mso-top-percent:-10001;mso-position-horizontal:absolute;mso-position-horizontal-relative:char;mso-position-vertical:absolute;mso-position-vertical-relative:line;mso-width-percent:0;mso-height-percent:0;mso-left-percent:-10001;mso-top-percent:-10001" o:hralign="center" o:hrstd="t" strokeweight="1pt">
+          <v:rect id="_x0000_s1033" alt="" style="width:475.5pt;height:.05pt;mso-width-percent:0;mso-height-percent:0;mso-left-percent:-10001;mso-top-percent:-10001;mso-position-horizontal:absolute;mso-position-horizontal-relative:char;mso-position-vertical:absolute;mso-position-vertical-relative:line;mso-width-percent:0;mso-height-percent:0;mso-left-percent:-10001;mso-top-percent:-10001" o:hralign="center" o:hrstd="t" strokeweight="1pt">
             <v:stroke opacity="0"/>
           </v:rect>
         </w:pict>
@@ -2936,7 +3035,21 @@
           <w:rFonts w:eastAsia="Georgia" w:hAnsi="Georgia" w:cs="Georgia"/>
           <w:color w:val="000000"/>
         </w:rPr>
-        <w:t>Clique no ícone 🖨 na linha do empréstimo desejado</w:t>
+        <w:t xml:space="preserve">Clique no ícone </w:t>
+      </w:r>
+      <w:r>
+        <w:rPr>
+          <w:rFonts w:eastAsia="Georgia" w:hAnsi="Georgia" w:cs="Georgia"/>
+          <w:color w:val="000000"/>
+        </w:rPr>
+        <w:t>🖨</w:t>
+      </w:r>
+      <w:r>
+        <w:rPr>
+          <w:rFonts w:eastAsia="Georgia" w:hAnsi="Georgia" w:cs="Georgia"/>
+          <w:color w:val="000000"/>
+        </w:rPr>
+        <w:t xml:space="preserve"> na linha do empréstimo desejado</w:t>
       </w:r>
     </w:p>
     <w:p>
@@ -3098,7 +3211,7 @@
           <w:noProof/>
         </w:rPr>
         <w:pict w14:anchorId="7AE88D2D">
-          <v:rect id="_x0000_s1034" alt="" style="width:475.5pt;height:.05pt;mso-width-percent:0;mso-height-percent:0;mso-left-percent:-10001;mso-top-percent:-10001;mso-position-horizontal:absolute;mso-position-horizontal-relative:char;mso-position-vertical:absolute;mso-position-vertical-relative:line;mso-width-percent:0;mso-height-percent:0;mso-left-percent:-10001;mso-top-percent:-10001" o:hralign="center" o:hrstd="t" strokeweight="1pt">
+          <v:rect id="_x0000_s1032" alt="" style="width:475.5pt;height:.05pt;mso-width-percent:0;mso-height-percent:0;mso-left-percent:-10001;mso-top-percent:-10001;mso-position-horizontal:absolute;mso-position-horizontal-relative:char;mso-position-vertical:absolute;mso-position-vertical-relative:line;mso-width-percent:0;mso-height-percent:0;mso-left-percent:-10001;mso-top-percent:-10001" o:hralign="center" o:hrstd="t" strokeweight="1pt">
             <v:stroke opacity="0"/>
           </v:rect>
         </w:pict>
@@ -3256,7 +3369,7 @@
           <w:noProof/>
         </w:rPr>
         <w:pict w14:anchorId="41856150">
-          <v:rect id="_x0000_s1033" alt="" style="width:475.5pt;height:.05pt;mso-width-percent:0;mso-height-percent:0;mso-left-percent:-10001;mso-top-percent:-10001;mso-position-horizontal:absolute;mso-position-horizontal-relative:char;mso-position-vertical:absolute;mso-position-vertical-relative:line;mso-width-percent:0;mso-height-percent:0;mso-left-percent:-10001;mso-top-percent:-10001" o:hralign="center" o:hrstd="t" strokeweight="1pt">
+          <v:rect id="_x0000_s1031" alt="" style="width:475.5pt;height:.05pt;mso-width-percent:0;mso-height-percent:0;mso-left-percent:-10001;mso-top-percent:-10001;mso-position-horizontal:absolute;mso-position-horizontal-relative:char;mso-position-vertical:absolute;mso-position-vertical-relative:line;mso-width-percent:0;mso-height-percent:0;mso-left-percent:-10001;mso-top-percent:-10001" o:hralign="center" o:hrstd="t" strokeweight="1pt">
             <v:stroke opacity="0"/>
           </v:rect>
         </w:pict>
@@ -3436,7 +3549,21 @@
           <w:rFonts w:eastAsia="Georgia" w:hAnsi="Georgia" w:cs="Georgia"/>
           <w:color w:val="000000"/>
         </w:rPr>
-        <w:t>Na lista de categorias, clique no ícone ✏️ da categoria desejada</w:t>
+        <w:t>Na lista de categorias, clique no ícone ✏</w:t>
+      </w:r>
+      <w:r>
+        <w:rPr>
+          <w:rFonts w:eastAsia="Georgia" w:hAnsi="Georgia" w:cs="Georgia"/>
+          <w:color w:val="000000"/>
+        </w:rPr>
+        <w:t>️</w:t>
+      </w:r>
+      <w:r>
+        <w:rPr>
+          <w:rFonts w:eastAsia="Georgia" w:hAnsi="Georgia" w:cs="Georgia"/>
+          <w:color w:val="000000"/>
+        </w:rPr>
+        <w:t xml:space="preserve"> da categoria desejada</w:t>
       </w:r>
     </w:p>
     <w:p>
@@ -3493,7 +3620,28 @@
           <w:rFonts w:eastAsia="Georgia" w:hAnsi="Georgia" w:cs="Georgia"/>
           <w:color w:val="000000"/>
         </w:rPr>
-        <w:t xml:space="preserve">Na lista, clique no ícone 🗑️ — disponível apenas se </w:t>
+        <w:t xml:space="preserve">Na lista, clique no ícone </w:t>
+      </w:r>
+      <w:r>
+        <w:rPr>
+          <w:rFonts w:eastAsia="Georgia" w:hAnsi="Georgia" w:cs="Georgia"/>
+          <w:color w:val="000000"/>
+        </w:rPr>
+        <w:t>🗑</w:t>
+      </w:r>
+      <w:r>
+        <w:rPr>
+          <w:rFonts w:eastAsia="Georgia" w:hAnsi="Georgia" w:cs="Georgia"/>
+          <w:color w:val="000000"/>
+        </w:rPr>
+        <w:t>️</w:t>
+      </w:r>
+      <w:r>
+        <w:rPr>
+          <w:rFonts w:eastAsia="Georgia" w:hAnsi="Georgia" w:cs="Georgia"/>
+          <w:color w:val="000000"/>
+        </w:rPr>
+        <w:t xml:space="preserve"> — disponível apenas se </w:t>
       </w:r>
       <w:r>
         <w:rPr>
@@ -3530,7 +3678,21 @@
           <w:rFonts w:eastAsia="Georgia" w:hAnsi="Georgia" w:cs="Georgia"/>
           <w:color w:val="000000"/>
         </w:rPr>
-        <w:t>⚠️ Categorias com itens vinculados não podem ser excluídas. Remova ou reatribua os itens antes.</w:t>
+        <w:t>⚠</w:t>
+      </w:r>
+      <w:r>
+        <w:rPr>
+          <w:rFonts w:eastAsia="Georgia" w:hAnsi="Georgia" w:cs="Georgia"/>
+          <w:color w:val="000000"/>
+        </w:rPr>
+        <w:t>️</w:t>
+      </w:r>
+      <w:r>
+        <w:rPr>
+          <w:rFonts w:eastAsia="Georgia" w:hAnsi="Georgia" w:cs="Georgia"/>
+          <w:color w:val="000000"/>
+        </w:rPr>
+        <w:t xml:space="preserve"> Categorias com itens vinculados não podem ser excluídas. Remova ou reatribua os itens antes.</w:t>
       </w:r>
     </w:p>
     <w:p>
@@ -4606,7 +4768,7 @@
           <w:szCs w:val="16"/>
         </w:rPr>
         <w:pict w14:anchorId="5D6B6C37">
-          <v:rect id="_x0000_s1031" alt="" style="width:475.5pt;height:.05pt;mso-width-percent:0;mso-height-percent:0;mso-left-percent:-10001;mso-top-percent:-10001;mso-position-horizontal:absolute;mso-position-horizontal-relative:char;mso-position-vertical:absolute;mso-position-vertical-relative:line;mso-width-percent:0;mso-height-percent:0;mso-left-percent:-10001;mso-top-percent:-10001" o:hralign="center" o:hrstd="t" strokeweight="1pt">
+          <v:rect id="_x0000_s1030" alt="" style="width:475.5pt;height:.05pt;mso-width-percent:0;mso-height-percent:0;mso-left-percent:-10001;mso-top-percent:-10001;mso-position-horizontal:absolute;mso-position-horizontal-relative:char;mso-position-vertical:absolute;mso-position-vertical-relative:line;mso-width-percent:0;mso-height-percent:0;mso-left-percent:-10001;mso-top-percent:-10001" o:hralign="center" o:hrstd="t" strokeweight="1pt">
             <v:stroke opacity="0"/>
           </v:rect>
         </w:pict>
@@ -4649,7 +4811,21 @@
           <w:rFonts w:eastAsia="Georgia" w:hAnsi="Georgia" w:cs="Georgia"/>
           <w:color w:val="000000"/>
         </w:rPr>
-        <w:t xml:space="preserve">⚠️ </w:t>
+        <w:t>⚠</w:t>
+      </w:r>
+      <w:r>
+        <w:rPr>
+          <w:rFonts w:eastAsia="Georgia" w:hAnsi="Georgia" w:cs="Georgia"/>
+          <w:color w:val="000000"/>
+        </w:rPr>
+        <w:t>️</w:t>
+      </w:r>
+      <w:r>
+        <w:rPr>
+          <w:rFonts w:eastAsia="Georgia" w:hAnsi="Georgia" w:cs="Georgia"/>
+          <w:color w:val="000000"/>
+        </w:rPr>
+        <w:t xml:space="preserve"> </w:t>
       </w:r>
       <w:r>
         <w:rPr>
@@ -4811,7 +4987,14 @@
           <w:rFonts w:eastAsia="Georgia" w:hAnsi="Georgia" w:cs="Georgia"/>
           <w:color w:val="000000"/>
         </w:rPr>
-        <w:t>📌 A ação é registrada no Log de Auditoria com os detalhes do que foi excluído.</w:t>
+        <w:t>📌</w:t>
+      </w:r>
+      <w:r>
+        <w:rPr>
+          <w:rFonts w:eastAsia="Georgia" w:hAnsi="Georgia" w:cs="Georgia"/>
+          <w:color w:val="000000"/>
+        </w:rPr>
+        <w:t xml:space="preserve"> A ação é registrada no Log de Auditoria com os detalhes do que foi excluído.</w:t>
       </w:r>
     </w:p>
     <w:p>
@@ -4832,7 +5015,7 @@
           <w:noProof/>
         </w:rPr>
         <w:pict w14:anchorId="541ED9BD">
-          <v:rect id="_x0000_s1030" alt="" style="width:475.5pt;height:.05pt;mso-width-percent:0;mso-height-percent:0;mso-left-percent:-10001;mso-top-percent:-10001;mso-position-horizontal:absolute;mso-position-horizontal-relative:char;mso-position-vertical:absolute;mso-position-vertical-relative:line;mso-width-percent:0;mso-height-percent:0;mso-left-percent:-10001;mso-top-percent:-10001" o:hralign="center" o:hrstd="t" strokeweight="1pt">
+          <v:rect id="_x0000_s1029" alt="" style="width:475.5pt;height:.05pt;mso-width-percent:0;mso-height-percent:0;mso-left-percent:-10001;mso-top-percent:-10001;mso-position-horizontal:absolute;mso-position-horizontal-relative:char;mso-position-vertical:absolute;mso-position-vertical-relative:line;mso-width-percent:0;mso-height-percent:0;mso-left-percent:-10001;mso-top-percent:-10001" o:hralign="center" o:hrstd="t" strokeweight="1pt">
             <v:stroke opacity="0"/>
           </v:rect>
         </w:pict>
@@ -5160,7 +5343,7 @@
           <w:szCs w:val="16"/>
         </w:rPr>
         <w:pict w14:anchorId="4FBC9527">
-          <v:rect id="_x0000_s1029" alt="" style="width:475.5pt;height:.05pt;mso-width-percent:0;mso-height-percent:0;mso-left-percent:-10001;mso-top-percent:-10001;mso-position-horizontal:absolute;mso-position-horizontal-relative:char;mso-position-vertical:absolute;mso-position-vertical-relative:line;mso-width-percent:0;mso-height-percent:0;mso-left-percent:-10001;mso-top-percent:-10001" o:hralign="center" o:hrstd="t" strokeweight="1pt">
+          <v:rect id="_x0000_s1028" alt="" style="width:475.5pt;height:.05pt;mso-width-percent:0;mso-height-percent:0;mso-left-percent:-10001;mso-top-percent:-10001;mso-position-horizontal:absolute;mso-position-horizontal-relative:char;mso-position-vertical:absolute;mso-position-vertical-relative:line;mso-width-percent:0;mso-height-percent:0;mso-left-percent:-10001;mso-top-percent:-10001" o:hralign="center" o:hrstd="t" strokeweight="1pt">
             <v:stroke opacity="0"/>
           </v:rect>
         </w:pict>
@@ -5348,7 +5531,7 @@
           <w:szCs w:val="16"/>
         </w:rPr>
         <w:pict w14:anchorId="3938AFAC">
-          <v:rect id="_x0000_s1028" alt="" style="width:475.5pt;height:.05pt;mso-width-percent:0;mso-height-percent:0;mso-left-percent:-10001;mso-top-percent:-10001;mso-position-horizontal:absolute;mso-position-horizontal-relative:char;mso-position-vertical:absolute;mso-position-vertical-relative:line;mso-width-percent:0;mso-height-percent:0;mso-left-percent:-10001;mso-top-percent:-10001" o:hralign="center" o:hrstd="t" strokeweight="1pt">
+          <v:rect id="_x0000_s1027" alt="" style="width:475.5pt;height:.05pt;mso-width-percent:0;mso-height-percent:0;mso-left-percent:-10001;mso-top-percent:-10001;mso-position-horizontal:absolute;mso-position-horizontal-relative:char;mso-position-vertical:absolute;mso-position-vertical-relative:line;mso-width-percent:0;mso-height-percent:0;mso-left-percent:-10001;mso-top-percent:-10001" o:hralign="center" o:hrstd="t" strokeweight="1pt">
             <v:stroke opacity="0"/>
           </v:rect>
         </w:pict>
@@ -5705,7 +5888,7 @@
           <w:szCs w:val="16"/>
         </w:rPr>
         <w:pict w14:anchorId="0B3F8CB5">
-          <v:rect id="_x0000_s1027" alt="" style="width:475.5pt;height:.05pt;mso-width-percent:0;mso-height-percent:0;mso-left-percent:-10001;mso-top-percent:-10001;mso-position-horizontal:absolute;mso-position-horizontal-relative:char;mso-position-vertical:absolute;mso-position-vertical-relative:line;mso-width-percent:0;mso-height-percent:0;mso-left-percent:-10001;mso-top-percent:-10001" o:hralign="center" o:hrstd="t" strokeweight="1pt">
+          <v:rect id="_x0000_s1026" alt="" style="width:475.5pt;height:.05pt;mso-width-percent:0;mso-height-percent:0;mso-left-percent:-10001;mso-top-percent:-10001;mso-position-horizontal:absolute;mso-position-horizontal-relative:char;mso-position-vertical:absolute;mso-position-vertical-relative:line;mso-width-percent:0;mso-height-percent:0;mso-left-percent:-10001;mso-top-percent:-10001" o:hralign="center" o:hrstd="t" strokeweight="1pt">
             <v:stroke opacity="0"/>
           </v:rect>
         </w:pict>

</xml_diff>